<commit_message>
Correccion 03 -Terminado hasta Zuñiga y 02 tambien las faltantes hechas
</commit_message>
<xml_diff>
--- a/Practicos/Notas y Devoluciones 02.docx
+++ b/Practicos/Notas y Devoluciones 02.docx
@@ -201,10 +201,7 @@
     <w:p/>
     <w:p>
       <w:r>
-        <w:t>Diego</w:t>
-      </w:r>
-      <w:r>
-        <w:t>, excelente trabajo, el resultado es el que se solicitó en enunciado.</w:t>
+        <w:t>Diego, excelente trabajo, el resultado es el que se solicitó en enunciado.</w:t>
       </w:r>
     </w:p>
     <w:p/>
@@ -437,10 +434,7 @@
     <w:p/>
     <w:p>
       <w:r>
-        <w:t>Santiago</w:t>
-      </w:r>
-      <w:r>
-        <w:t>, excelente trabajo, el resultado es el que se solicitó en enunciado.</w:t>
+        <w:t>Santiago, excelente trabajo, el resultado es el que se solicitó en enunciado.</w:t>
       </w:r>
     </w:p>
     <w:p/>
@@ -600,10 +594,7 @@
     <w:p/>
     <w:p>
       <w:r>
-        <w:t>Belen</w:t>
-      </w:r>
-      <w:r>
-        <w:t>, excelente trabajo, el resultado es el que se solicitó en enunciado.</w:t>
+        <w:t>Belen, excelente trabajo, el resultado es el que se solicitó en enunciado.</w:t>
       </w:r>
     </w:p>
     <w:p/>
@@ -997,10 +988,7 @@
     <w:p/>
     <w:p>
       <w:r>
-        <w:t>Gianluca</w:t>
-      </w:r>
-      <w:r>
-        <w:t>, excelente trabajo, el resultado es el que se solicitó en enunciado.</w:t>
+        <w:t>Gianluca, excelente trabajo, el resultado es el que se solicitó en enunciado.</w:t>
       </w:r>
     </w:p>
     <w:p/>
@@ -1025,10 +1013,7 @@
     <w:p/>
     <w:p>
       <w:r>
-        <w:t>Destaco que completaste los atributos alt de las imágenes, esto ayuda a mejorar la accesibilidad de sito web.</w:t>
-      </w:r>
-      <w:r>
-        <w:t xml:space="preserve"> Los detalles de estilos con los bordes quedaron muy bien ¡</w:t>
+        <w:t>Destaco que completaste los atributos alt de las imágenes, esto ayuda a mejorar la accesibilidad de sito web. Los detalles de estilos con los bordes quedaron muy bien ¡</w:t>
       </w:r>
     </w:p>
     <w:p/>
@@ -1102,71 +1087,61 @@
         <w:t>🎉</w:t>
       </w:r>
       <w:r>
-        <w:t xml:space="preserve">¡Felicitaciones por la entrega del Desafío 01! </w:t>
-      </w:r>
-      <w:r>
-        <w:rPr>
-          <w:rFonts w:ascii="Segoe UI Emoji" w:hAnsi="Segoe UI Emoji" w:cs="Segoe UI Emoji"/>
-        </w:rPr>
-        <w:t>🎉</w:t>
-      </w:r>
-    </w:p>
-    <w:p/>
-    <w:p>
-      <w:r>
-        <w:t>Hola Santino, quería felicitarte por el trabajo que realizaste. El resultado renderizado es el solicitado.</w:t>
-      </w:r>
-    </w:p>
-    <w:p/>
-    <w:p>
-      <w:r>
-        <w:t>Es correcta estructura del documento HTML. Respetaste el orden de aplicación de uso de etiquetas de encabezado (h1, h2, etc..) y el manejo de etiquetas para textos es correcto, eso es genial.</w:t>
-      </w:r>
-    </w:p>
-    <w:p/>
-    <w:p/>
-    <w:p>
-      <w:r>
-        <w:t>Observaciones:</w:t>
-      </w:r>
-    </w:p>
-    <w:p/>
-    <w:p>
-      <w:r>
-        <w:t>Recorda cambiar el lenguaje a español &lt;html lang="es"&gt; porque esto le dice a los motores de búsqueda en que idioma esta tu sitio web.</w:t>
-      </w:r>
-    </w:p>
-    <w:p/>
-    <w:p>
-      <w:r>
-        <w:t xml:space="preserve">Recaudo con el uso de la etiqueta &lt;strong&gt;, recorda que le dice a los motores de búsqueda que esa info es importante y que la tome en cuenta cuando imprime los resultados de búsqueda, por lo cual es recomendable utilizarla con recaudo. Por ejemplo en la parte del significado del </w:t>
-      </w:r>
+        <w:t xml:space="preserve">¡Felicitaciones por la entrega del Desafío 02! </w:t>
+      </w:r>
+      <w:r>
+        <w:rPr>
+          <w:rFonts w:ascii="Segoe UI Emoji" w:hAnsi="Segoe UI Emoji" w:cs="Segoe UI Emoji"/>
+        </w:rPr>
+        <w:t>🎉</w:t>
+      </w:r>
+    </w:p>
+    <w:p/>
+    <w:p>
+      <w:r>
+        <w:t>Santino</w:t>
+      </w:r>
+      <w:r>
+        <w:t>, excelente trabajo, el resultado es el que se solicitó en enunciado.</w:t>
+      </w:r>
+    </w:p>
+    <w:p/>
+    <w:p>
+      <w:r>
+        <w:t>La estructura HTML esta impecable, destaco la correcta implementación de contenedores semánticos como main, section, footer, etc. El manejo de listas, textos y títulos es correcto</w:t>
+      </w:r>
+    </w:p>
+    <w:p/>
+    <w:p>
+      <w:r>
+        <w:t>La manipulación de enlaces relativos o absolutos quedo perfecto. Genial que aplicaste pseudoclases para los enlaces.</w:t>
+      </w:r>
+    </w:p>
+    <w:p/>
+    <w:p>
+      <w:r>
+        <w:t>La vinculación de la página de estilos externa es correcta, buenisimo que usaste clases e id’s, quedo genial.</w:t>
+      </w:r>
+    </w:p>
+    <w:p/>
+    <w:p>
+      <w:r>
+        <w:t>Destaco que completaste los atributos alt de las imágenes, esto ayuda a mejorar la accesibilidad de sito web.</w:t>
+      </w:r>
+    </w:p>
+    <w:p/>
+    <w:p/>
+    <w:p>
       <w:r>
         <w:lastRenderedPageBreak/>
-        <w:t>término MERN que la primer letra del item va en negrita podes utilizar en lugar de &lt;strong&gt; la etiqueta &lt;b&gt; que pone en negrita la letra pero con un fin mas que todo de estética visual para el usuario.</w:t>
-      </w:r>
-    </w:p>
-    <w:p/>
-    <w:p/>
-    <w:p>
-      <w:r>
-        <w:t>Muy buen</w:t>
-      </w:r>
-      <w:r>
-        <w:t xml:space="preserve"> trabajo ¡</w:t>
-      </w:r>
-    </w:p>
-    <w:p/>
-    <w:p>
-      <w:r>
-        <w:t xml:space="preserve">Tu nota en el Desafío 01 es: </w:t>
-      </w:r>
-      <w:r>
-        <w:rPr>
-          <w:b/>
-          <w:bCs/>
-        </w:rPr>
-        <w:t>9</w:t>
+        <w:t xml:space="preserve">Tu nota en el Desafío 02 es: </w:t>
+      </w:r>
+      <w:r>
+        <w:rPr>
+          <w:b/>
+          <w:bCs/>
+        </w:rPr>
+        <w:t>10</w:t>
       </w:r>
     </w:p>
     <w:p/>
@@ -1229,10 +1204,7 @@
     <w:p/>
     <w:p>
       <w:r>
-        <w:t>Hipolito</w:t>
-      </w:r>
-      <w:r>
-        <w:t>, excelente trabajo, el resultado es el que se solicitó en enunciado.</w:t>
+        <w:t>Hipolito, excelente trabajo, el resultado es el que se solicitó en enunciado.</w:t>
       </w:r>
     </w:p>
     <w:p/>
@@ -1345,10 +1317,7 @@
     <w:p/>
     <w:p>
       <w:r>
-        <w:t>Tomas</w:t>
-      </w:r>
-      <w:r>
-        <w:t>, excelente trabajo, el resultado es el que se solicitó en enunciado.</w:t>
+        <w:t>Tomas, excelente trabajo, el resultado es el que se solicitó en enunciado.</w:t>
       </w:r>
     </w:p>
     <w:p/>
@@ -1461,10 +1430,7 @@
     <w:p/>
     <w:p>
       <w:r>
-        <w:t>Ariana</w:t>
-      </w:r>
-      <w:r>
-        <w:t>, excelente trabajo, el resultado es el que se solicitó en enunciado.</w:t>
+        <w:t>Ariana, excelente trabajo, el resultado es el que se solicitó en enunciado.</w:t>
       </w:r>
     </w:p>
     <w:p/>
@@ -1475,7 +1441,6 @@
     </w:p>
     <w:p>
       <w:r>
-        <w:lastRenderedPageBreak/>
         <w:t>Genial que trabajaste con fuentes de Google, quedo muy bien.</w:t>
       </w:r>
     </w:p>
@@ -1591,10 +1556,7 @@
     <w:p/>
     <w:p>
       <w:r>
-        <w:t>Franco</w:t>
-      </w:r>
-      <w:r>
-        <w:t>, excelente trabajo, el resultado es el que se solicitó en enunciado.</w:t>
+        <w:t>Franco, excelente trabajo, el resultado es el que se solicitó en enunciado.</w:t>
       </w:r>
     </w:p>
     <w:p/>
@@ -1783,76 +1745,79 @@
           <w:b/>
           <w:bCs/>
         </w:rPr>
+        <w:t>Bravo Sergio</w:t>
+      </w:r>
+    </w:p>
+    <w:p>
+      <w:pPr>
+        <w:rPr>
+          <w:rFonts w:ascii="Segoe UI Emoji" w:hAnsi="Segoe UI Emoji" w:cs="Segoe UI Emoji"/>
+          <w:b/>
+          <w:bCs/>
+        </w:rPr>
+      </w:pPr>
+    </w:p>
+    <w:p>
+      <w:pPr>
+        <w:rPr>
+          <w:rFonts w:ascii="Segoe UI Emoji" w:hAnsi="Segoe UI Emoji" w:cs="Segoe UI Emoji"/>
+        </w:rPr>
+      </w:pPr>
+      <w:r>
+        <w:rPr>
+          <w:rFonts w:ascii="Segoe UI Emoji" w:hAnsi="Segoe UI Emoji" w:cs="Segoe UI Emoji"/>
+        </w:rPr>
+        <w:t>🎉</w:t>
+      </w:r>
+      <w:r>
+        <w:t xml:space="preserve">¡Felicitaciones por la entrega del Desafío 02! </w:t>
+      </w:r>
+      <w:r>
+        <w:rPr>
+          <w:rFonts w:ascii="Segoe UI Emoji" w:hAnsi="Segoe UI Emoji" w:cs="Segoe UI Emoji"/>
+        </w:rPr>
+        <w:t>🎉</w:t>
+      </w:r>
+    </w:p>
+    <w:p/>
+    <w:p>
+      <w:r>
+        <w:t>Sergio</w:t>
+      </w:r>
+      <w:r>
+        <w:t>, excelente trabajo, el resultado es el que se solicitó en enunciado.</w:t>
+      </w:r>
+    </w:p>
+    <w:p/>
+    <w:p>
+      <w:r>
         <w:lastRenderedPageBreak/>
-        <w:t>Bravo Sergio</w:t>
-      </w:r>
-    </w:p>
-    <w:p>
-      <w:pPr>
-        <w:rPr>
-          <w:rFonts w:ascii="Segoe UI Emoji" w:hAnsi="Segoe UI Emoji" w:cs="Segoe UI Emoji"/>
-          <w:b/>
-          <w:bCs/>
-        </w:rPr>
-      </w:pPr>
-    </w:p>
-    <w:p>
-      <w:pPr>
-        <w:rPr>
-          <w:rFonts w:ascii="Segoe UI Emoji" w:hAnsi="Segoe UI Emoji" w:cs="Segoe UI Emoji"/>
-        </w:rPr>
-      </w:pPr>
-      <w:r>
-        <w:rPr>
-          <w:rFonts w:ascii="Segoe UI Emoji" w:hAnsi="Segoe UI Emoji" w:cs="Segoe UI Emoji"/>
-        </w:rPr>
-        <w:t>🎉</w:t>
-      </w:r>
-      <w:r>
-        <w:t xml:space="preserve">¡Felicitaciones por la entrega del Desafío 01! </w:t>
-      </w:r>
-      <w:r>
-        <w:rPr>
-          <w:rFonts w:ascii="Segoe UI Emoji" w:hAnsi="Segoe UI Emoji" w:cs="Segoe UI Emoji"/>
-        </w:rPr>
-        <w:t>🎉</w:t>
-      </w:r>
-    </w:p>
-    <w:p/>
-    <w:p>
-      <w:r>
-        <w:t>Primeramente, quería felicitarte por el trabajo que realizaste. El resultado renderizado es el solicitado.</w:t>
-      </w:r>
-    </w:p>
-    <w:p/>
-    <w:p>
-      <w:r>
-        <w:t>Destaco la correcta estructura del documento HTML, genial que hayas declarado el lenguaje del documento en español, estos pequeños detalles van sumando a la legibilidad de la estructura.</w:t>
-      </w:r>
-    </w:p>
-    <w:p/>
-    <w:p>
-      <w:r>
-        <w:t xml:space="preserve">Respetaste el orden de aplicación de uso de etiquetas de encabezado (h1, h2, etc..) y el manejo de etiquetas para textos es correcto. </w:t>
-      </w:r>
-    </w:p>
-    <w:p/>
-    <w:p>
-      <w:r>
-        <w:t xml:space="preserve">Buenísimo que aplicaste etiquetas &lt;b&gt; para resaltar en negrita textos, te falto aplicar palabras claves con etiquetas &lt;strong&gt;, recorda que ayudan para que los motores de búsqueda entiendan mejor el contenido de tu documento web. </w:t>
-      </w:r>
-    </w:p>
-    <w:p/>
-    <w:p/>
-    <w:p>
-      <w:r>
-        <w:t>Excelente trabajo ¡</w:t>
-      </w:r>
-    </w:p>
-    <w:p/>
-    <w:p>
-      <w:r>
-        <w:t xml:space="preserve">Tu nota en el Desafío 01 es: </w:t>
+        <w:t>La estructura HTML esta impecable, destaco la correcta implementación de contenedores semánticos como main, section, footer, etc. El manejo de listas, textos y títulos es correcto</w:t>
+      </w:r>
+    </w:p>
+    <w:p/>
+    <w:p>
+      <w:r>
+        <w:t>La manipulación de enlaces relativos o absolutos quedo perfecto. Genial que aplicaste pseudoclases para los enlaces.</w:t>
+      </w:r>
+    </w:p>
+    <w:p/>
+    <w:p>
+      <w:r>
+        <w:t>La vinculación de la página de estilos externa es correcta, buenisimo que usaste clases e id’s, quedo genial.</w:t>
+      </w:r>
+    </w:p>
+    <w:p/>
+    <w:p>
+      <w:r>
+        <w:t>Destaco que completaste los atributos alt de las imágenes, esto ayuda a mejorar la accesibilidad de sito web.</w:t>
+      </w:r>
+    </w:p>
+    <w:p/>
+    <w:p/>
+    <w:p>
+      <w:r>
+        <w:t xml:space="preserve">Tu nota en el Desafío 02 es: </w:t>
       </w:r>
       <w:r>
         <w:rPr>
@@ -1931,10 +1896,7 @@
     <w:p/>
     <w:p>
       <w:r>
-        <w:t>Sofia</w:t>
-      </w:r>
-      <w:r>
-        <w:t xml:space="preserve">, </w:t>
+        <w:t xml:space="preserve">Sofia, </w:t>
       </w:r>
       <w:r>
         <w:t>muy buen</w:t>
@@ -1946,25 +1908,25 @@
     <w:p/>
     <w:p>
       <w:r>
+        <w:t>La estructura HTML esta impecable, destaco la correcta implementación de contenedores semánticos como main, section, footer, etc. El manejo de listas, textos y títulos es correcto.</w:t>
+      </w:r>
+    </w:p>
+    <w:p/>
+    <w:p>
+      <w:r>
+        <w:t>La manipulación de enlaces relativos o absolutos quedo perfecto. Genial que aplicaste pseudoclases para los enlaces.</w:t>
+      </w:r>
+    </w:p>
+    <w:p/>
+    <w:p>
+      <w:r>
+        <w:t>La vinculación de la página de estilos externa es correcta, buenisimo que usaste clases e id’s, quedo genial.</w:t>
+      </w:r>
+    </w:p>
+    <w:p/>
+    <w:p>
+      <w:r>
         <w:lastRenderedPageBreak/>
-        <w:t>La estructura HTML esta impecable, destaco la correcta implementación de contenedores semánticos como main, section, footer, etc. El manejo de listas, textos y títulos es correcto.</w:t>
-      </w:r>
-    </w:p>
-    <w:p/>
-    <w:p>
-      <w:r>
-        <w:t>La manipulación de enlaces relativos o absolutos quedo perfecto. Genial que aplicaste pseudoclases para los enlaces.</w:t>
-      </w:r>
-    </w:p>
-    <w:p/>
-    <w:p>
-      <w:r>
-        <w:t>La vinculación de la página de estilos externa es correcta, buenisimo que usaste clases e id’s, quedo genial.</w:t>
-      </w:r>
-    </w:p>
-    <w:p/>
-    <w:p>
-      <w:r>
         <w:t>Destaco que completaste los atributos alt de las imágenes, esto ayuda a mejorar la accesibilidad de sito web.</w:t>
       </w:r>
       <w:r>
@@ -2071,10 +2033,7 @@
     <w:p/>
     <w:p>
       <w:r>
-        <w:t>Catalina</w:t>
-      </w:r>
-      <w:r>
-        <w:t>, excelente trabajo, el resultado es el que se solicitó en enunciado.</w:t>
+        <w:t>Catalina, excelente trabajo, el resultado es el que se solicitó en enunciado.</w:t>
       </w:r>
     </w:p>
     <w:p/>
@@ -2239,7 +2198,6 @@
           <w:b/>
           <w:bCs/>
         </w:rPr>
-        <w:lastRenderedPageBreak/>
         <w:t>Zabala Pons Gonzalo</w:t>
       </w:r>
     </w:p>
@@ -2265,61 +2223,53 @@
         <w:t>🎉</w:t>
       </w:r>
       <w:r>
-        <w:t xml:space="preserve">¡Felicitaciones por la entrega del Desafío 01! </w:t>
-      </w:r>
-      <w:r>
-        <w:rPr>
-          <w:rFonts w:ascii="Segoe UI Emoji" w:hAnsi="Segoe UI Emoji" w:cs="Segoe UI Emoji"/>
-        </w:rPr>
-        <w:t>🎉</w:t>
-      </w:r>
-    </w:p>
-    <w:p>
-      <w:pPr>
-        <w:rPr>
-          <w:rFonts w:ascii="Segoe UI Emoji" w:hAnsi="Segoe UI Emoji" w:cs="Segoe UI Emoji"/>
-          <w:b/>
-          <w:bCs/>
-        </w:rPr>
-      </w:pPr>
-    </w:p>
+        <w:t xml:space="preserve">¡Felicitaciones por la entrega del Desafío 02! </w:t>
+      </w:r>
+      <w:r>
+        <w:rPr>
+          <w:rFonts w:ascii="Segoe UI Emoji" w:hAnsi="Segoe UI Emoji" w:cs="Segoe UI Emoji"/>
+        </w:rPr>
+        <w:t>🎉</w:t>
+      </w:r>
+    </w:p>
+    <w:p/>
     <w:p>
       <w:r>
         <w:t>Gonzalo</w:t>
       </w:r>
       <w:r>
-        <w:t>, quería felicitarte por el trabajo que realizaste. El resultado renderizado es el solicitado.</w:t>
-      </w:r>
-    </w:p>
-    <w:p/>
-    <w:p>
-      <w:r>
-        <w:t>Destaco la correcta estructura del documento HTML, genial que hayas declarado el lenguaje del documento en español, estos pequeños detalles van sumando a la legibilidad de la estructura.</w:t>
-      </w:r>
-    </w:p>
-    <w:p/>
-    <w:p>
-      <w:r>
-        <w:t xml:space="preserve">Respetaste el orden de aplicación de uso de etiquetas de encabezado (h1, h2, etc..) y el manejo de etiquetas para textos es correcto. </w:t>
-      </w:r>
-    </w:p>
-    <w:p/>
-    <w:p>
-      <w:r>
-        <w:t xml:space="preserve">Buenísimo que hayas diferenciado cuando usar etiquetas &lt;strong&gt; y &lt;b&gt; </w:t>
-      </w:r>
-    </w:p>
-    <w:p/>
-    <w:p/>
-    <w:p>
-      <w:r>
-        <w:t>Excelente trabajo ¡</w:t>
-      </w:r>
-    </w:p>
-    <w:p/>
-    <w:p>
-      <w:r>
-        <w:t xml:space="preserve">Tu nota en el Desafío 01 es: </w:t>
+        <w:t>, excelente trabajo, el resultado es el que se solicitó en enunciado.</w:t>
+      </w:r>
+    </w:p>
+    <w:p/>
+    <w:p>
+      <w:r>
+        <w:t>La estructura HTML esta impecable, destaco la correcta implementación de contenedores semánticos como main, section, footer, etc. El manejo de listas, textos y títulos es correcto</w:t>
+      </w:r>
+    </w:p>
+    <w:p/>
+    <w:p>
+      <w:r>
+        <w:t>La manipulación de enlaces relativos o absolutos quedo perfecto. Genial que aplicaste pseudoclases para los enlaces.</w:t>
+      </w:r>
+    </w:p>
+    <w:p/>
+    <w:p>
+      <w:r>
+        <w:t>La vinculación de la página de estilos externa es correcta, buenisimo que usaste clases e id’s, quedo genial.</w:t>
+      </w:r>
+    </w:p>
+    <w:p/>
+    <w:p>
+      <w:r>
+        <w:t>Destaco que completaste los atributos alt de las imágenes, esto ayuda a mejorar la accesibilidad de sito web.</w:t>
+      </w:r>
+    </w:p>
+    <w:p/>
+    <w:p/>
+    <w:p>
+      <w:r>
+        <w:t xml:space="preserve">Tu nota en el Desafío 02 es: </w:t>
       </w:r>
       <w:r>
         <w:rPr>
@@ -2416,7 +2366,6 @@
     <w:p/>
     <w:p>
       <w:r>
-        <w:lastRenderedPageBreak/>
         <w:t>La manipulación de enlaces relativos o absolutos quedo perfecto. Genial que aplicaste pseudoclases para los enlaces.</w:t>
       </w:r>
     </w:p>
@@ -2564,28 +2513,28 @@
     <w:p/>
     <w:p>
       <w:r>
+        <w:t>Adrian</w:t>
+      </w:r>
+      <w:r>
+        <w:t>o, excelente trabajo, el resultado es el que se solicitó en enunciado.</w:t>
+      </w:r>
+    </w:p>
+    <w:p/>
+    <w:p>
+      <w:r>
+        <w:t>La estructura HTML esta impecable, destaco la correcta implementación de contenedores semánticos como main, section, footer, etc. El manejo de listas, textos y títulos es correcto</w:t>
+      </w:r>
+    </w:p>
+    <w:p/>
+    <w:p>
+      <w:r>
+        <w:t>La manipulación de enlaces relativos o absolutos quedo perfecto. Genial que aplicaste pseudoclases para los enlaces.</w:t>
+      </w:r>
+    </w:p>
+    <w:p/>
+    <w:p>
+      <w:r>
         <w:lastRenderedPageBreak/>
-        <w:t>Adrian</w:t>
-      </w:r>
-      <w:r>
-        <w:t>o, excelente trabajo, el resultado es el que se solicitó en enunciado.</w:t>
-      </w:r>
-    </w:p>
-    <w:p/>
-    <w:p>
-      <w:r>
-        <w:t>La estructura HTML esta impecable, destaco la correcta implementación de contenedores semánticos como main, section, footer, etc. El manejo de listas, textos y títulos es correcto</w:t>
-      </w:r>
-    </w:p>
-    <w:p/>
-    <w:p>
-      <w:r>
-        <w:t>La manipulación de enlaces relativos o absolutos quedo perfecto. Genial que aplicaste pseudoclases para los enlaces.</w:t>
-      </w:r>
-    </w:p>
-    <w:p/>
-    <w:p>
-      <w:r>
         <w:t>La vinculación de la página de estilos externa es correcta, buenisimo que usaste clases e id’s, quedo genial.</w:t>
       </w:r>
     </w:p>
@@ -3275,7 +3224,7 @@
   <w:style w:type="paragraph" w:default="1" w:styleId="Normal">
     <w:name w:val="Normal"/>
     <w:qFormat/>
-    <w:rsid w:val="00E94F61"/>
+    <w:rsid w:val="00577DB1"/>
     <w:rPr>
       <w:kern w:val="2"/>
       <w14:ligatures w14:val="standardContextual"/>

</xml_diff>